<commit_message>
Add phone number (424) 999-0548 across all pages
- CONTACT.md: added phone, fixed press email to media@, added all department emails
- PRESS.md: added phone to press contact section
- FACT_SHEET.html: added phone to footer
- FACT_SHEET.pdf: rebuilt with phone in footer
- FACT_SHEET.docx: rebuilt with phone in contact section
</commit_message>
<xml_diff>
--- a/website/FACT_SHEET.docx
+++ b/website/FACT_SHEET.docx
@@ -918,7 +918,32 @@
           <w:sz w:val="18"/>
           <w:szCs w:val="18"/>
         </w:rPr>
-        <w:t xml:space="preserve">     Speaking: </w:t>
+        <w:t xml:space="preserve">     Phone: </w:t>
+      </w:r>
+      <w:r>
+        <w:rPr>
+          <w:rFonts w:ascii="Arial" w:cs="Arial" w:eastAsia="Arial" w:hAnsi="Arial"/>
+          <w:color w:val="C9A94E"/>
+          <w:sz w:val="18"/>
+          <w:szCs w:val="18"/>
+        </w:rPr>
+        <w:t xml:space="preserve">(424) 999-0548</w:t>
+      </w:r>
+    </w:p>
+    <w:p>
+      <w:pPr>
+        <w:spacing w:after="60"/>
+      </w:pPr>
+      <w:r>
+        <w:rPr>
+          <w:rFonts w:ascii="Arial" w:cs="Arial" w:eastAsia="Arial" w:hAnsi="Arial"/>
+          <w:b/>
+          <w:bCs/>
+          <w:color w:val="1A1A2E"/>
+          <w:sz w:val="18"/>
+          <w:szCs w:val="18"/>
+        </w:rPr>
+        <w:t xml:space="preserve">Speaking: </w:t>
       </w:r>
       <w:r>
         <w:rPr>
@@ -929,21 +954,16 @@
         </w:rPr>
         <w:t xml:space="preserve">speaking@audacionailabs.com</w:t>
       </w:r>
-    </w:p>
-    <w:p>
-      <w:pPr>
-        <w:spacing w:after="60"/>
-      </w:pPr>
-      <w:r>
-        <w:rPr>
-          <w:rFonts w:ascii="Arial" w:cs="Arial" w:eastAsia="Arial" w:hAnsi="Arial"/>
-          <w:b/>
-          <w:bCs/>
-          <w:color w:val="1A1A2E"/>
-          <w:sz w:val="18"/>
-          <w:szCs w:val="18"/>
-        </w:rPr>
-        <w:t xml:space="preserve">Web: </w:t>
+      <w:r>
+        <w:rPr>
+          <w:rFonts w:ascii="Arial" w:cs="Arial" w:eastAsia="Arial" w:hAnsi="Arial"/>
+          <w:b/>
+          <w:bCs/>
+          <w:color w:val="1A1A2E"/>
+          <w:sz w:val="18"/>
+          <w:szCs w:val="18"/>
+        </w:rPr>
+        <w:t xml:space="preserve">     Web: </w:t>
       </w:r>
       <w:r>
         <w:rPr>
@@ -953,26 +973,6 @@
           <w:szCs w:val="18"/>
         </w:rPr>
         <w:t xml:space="preserve">audacionailabs.com</w:t>
-      </w:r>
-      <w:r>
-        <w:rPr>
-          <w:rFonts w:ascii="Arial" w:cs="Arial" w:eastAsia="Arial" w:hAnsi="Arial"/>
-          <w:b/>
-          <w:bCs/>
-          <w:color w:val="1A1A2E"/>
-          <w:sz w:val="18"/>
-          <w:szCs w:val="18"/>
-        </w:rPr>
-        <w:t xml:space="preserve">     Founder: </w:t>
-      </w:r>
-      <w:r>
-        <w:rPr>
-          <w:rFonts w:ascii="Arial" w:cs="Arial" w:eastAsia="Arial" w:hAnsi="Arial"/>
-          <w:color w:val="C9A94E"/>
-          <w:sz w:val="18"/>
-          <w:szCs w:val="18"/>
-        </w:rPr>
-        <w:t xml:space="preserve">dee-williams.com</w:t>
       </w:r>
     </w:p>
     <w:p>

</xml_diff>